<commit_message>
Leave FRD field 2 blank: it is the registration date, not the defense date
The form's own instructions assign fields 2, 3 and 9 to the registration
process. The thesis was printing the defense date in field 2. Emptied
\FRDitadata, so both the thesis page and the standalone form now leave it blank,
alongside field 3's DCTA/ITA/DM - XXX/2026 placeholder.

Also replaces the one-off generation with
revisao-banca/secretaria/gerar_folha_registro.py, which reads the FRD macros
straight out of tese.tex and the page count out of the built PDF. Re-running it
after the library returns the date and number keeps the two documents identical
by construction rather than by hand.

Verified again: twelve fields match and field 2 is blank on both sides.

Co-Authored-By: Claude Opus 5 (1M context) <noreply@anthropic.com>
Claude-Session: https://claude.ai/code/session_01VAts4jD4WTSzCSqCkxjSJC
</commit_message>
<xml_diff>
--- a/revisao-banca/secretaria/PREENCHIDO_Folha_de_Registro.docx
+++ b/revisao-banca/secretaria/PREENCHIDO_Folha_de_Registro.docx
@@ -40,7 +40,6 @@
             <w:r>
               <w:rPr>
                 <w:rFonts w:ascii="Times New Roman" w:hAnsi="Times New Roman"/>
-                <w:caps/>
                 <w:sz w:val="15"/>
               </w:rPr>
               <w:t>1. CLASSIFICAÇÃO/TIPO</w:t>
@@ -53,7 +52,6 @@
             <w:r>
               <w:rPr>
                 <w:rFonts w:ascii="Times New Roman" w:hAnsi="Times New Roman"/>
-                <w:b w:val="0"/>
                 <w:sz w:val="20"/>
               </w:rPr>
               <w:t>DM</w:t>
@@ -72,7 +70,6 @@
             <w:r>
               <w:rPr>
                 <w:rFonts w:ascii="Times New Roman" w:hAnsi="Times New Roman"/>
-                <w:caps/>
                 <w:sz w:val="15"/>
               </w:rPr>
               <w:t>2. DATA</w:t>
@@ -85,10 +82,9 @@
             <w:r>
               <w:rPr>
                 <w:rFonts w:ascii="Times New Roman" w:hAnsi="Times New Roman"/>
-                <w:b w:val="0"/>
                 <w:sz w:val="20"/>
               </w:rPr>
-              <w:t>28 de julho de 2026</w:t>
+              <w:t xml:space="preserve"> </w:t>
             </w:r>
           </w:p>
         </w:tc>
@@ -104,7 +100,6 @@
             <w:r>
               <w:rPr>
                 <w:rFonts w:ascii="Times New Roman" w:hAnsi="Times New Roman"/>
-                <w:caps/>
                 <w:sz w:val="15"/>
               </w:rPr>
               <w:t>3. DOCUMENTO Nº</w:t>
@@ -117,7 +112,6 @@
             <w:r>
               <w:rPr>
                 <w:rFonts w:ascii="Times New Roman" w:hAnsi="Times New Roman"/>
-                <w:b w:val="0"/>
                 <w:color w:val="C00000"/>
                 <w:sz w:val="20"/>
               </w:rPr>
@@ -137,7 +131,6 @@
             <w:r>
               <w:rPr>
                 <w:rFonts w:ascii="Times New Roman" w:hAnsi="Times New Roman"/>
-                <w:caps/>
                 <w:sz w:val="15"/>
               </w:rPr>
               <w:t>4. Nº DE PÁGINAS</w:t>
@@ -150,7 +143,6 @@
             <w:r>
               <w:rPr>
                 <w:rFonts w:ascii="Times New Roman" w:hAnsi="Times New Roman"/>
-                <w:b w:val="0"/>
                 <w:sz w:val="20"/>
               </w:rPr>
               <w:t>155</w:t>
@@ -172,7 +164,6 @@
             <w:r>
               <w:rPr>
                 <w:rFonts w:ascii="Times New Roman" w:hAnsi="Times New Roman"/>
-                <w:caps/>
                 <w:sz w:val="15"/>
               </w:rPr>
               <w:t>5. TÍTULO E SUBTÍTULO:</w:t>
@@ -185,7 +176,6 @@
             <w:r>
               <w:rPr>
                 <w:rFonts w:ascii="Times New Roman" w:hAnsi="Times New Roman"/>
-                <w:b w:val="0"/>
                 <w:sz w:val="20"/>
               </w:rPr>
               <w:t>Object Detection and Tracking Using an Unmanned Aerial Vehicle</w:t>
@@ -207,7 +197,6 @@
             <w:r>
               <w:rPr>
                 <w:rFonts w:ascii="Times New Roman" w:hAnsi="Times New Roman"/>
-                <w:caps/>
                 <w:sz w:val="15"/>
               </w:rPr>
               <w:t>6. AUTOR(ES):</w:t>
@@ -220,7 +209,6 @@
             <w:r>
               <w:rPr>
                 <w:rFonts w:ascii="Times New Roman" w:hAnsi="Times New Roman"/>
-                <w:b w:val="0"/>
                 <w:sz w:val="20"/>
               </w:rPr>
               <w:t>Eric Ezequiel Yoshida de Lima</w:t>
@@ -242,7 +230,6 @@
             <w:r>
               <w:rPr>
                 <w:rFonts w:ascii="Times New Roman" w:hAnsi="Times New Roman"/>
-                <w:caps/>
                 <w:sz w:val="15"/>
               </w:rPr>
               <w:t>7. INSTITUIÇÃO(ÕES)/ÓRGÃO(S) INTERNO(S)/DIVISÃO(ÕES):</w:t>
@@ -255,7 +242,6 @@
             <w:r>
               <w:rPr>
                 <w:rFonts w:ascii="Times New Roman" w:hAnsi="Times New Roman"/>
-                <w:b w:val="0"/>
                 <w:sz w:val="20"/>
               </w:rPr>
               <w:t>Instituto Tecnológico de Aeronáutica – ITA</w:t>
@@ -277,7 +263,6 @@
             <w:r>
               <w:rPr>
                 <w:rFonts w:ascii="Times New Roman" w:hAnsi="Times New Roman"/>
-                <w:caps/>
                 <w:sz w:val="15"/>
               </w:rPr>
               <w:t>8. PALAVRAS-CHAVE SUGERIDAS PELO AUTOR:</w:t>
@@ -290,7 +275,6 @@
             <w:r>
               <w:rPr>
                 <w:rFonts w:ascii="Times New Roman" w:hAnsi="Times New Roman"/>
-                <w:b w:val="0"/>
                 <w:sz w:val="20"/>
               </w:rPr>
               <w:t>Unmanned aerial vehicles; Detect-and-avoid; Object tracking; Extended Kalman filter; 3D object detection; Sensor fusion; Convolutional neural networks.</w:t>
@@ -312,7 +296,6 @@
             <w:r>
               <w:rPr>
                 <w:rFonts w:ascii="Times New Roman" w:hAnsi="Times New Roman"/>
-                <w:caps/>
                 <w:sz w:val="15"/>
               </w:rPr>
               <w:t>9. PALAVRAS-CHAVE RESULTANTES DE INDEXAÇÃO:</w:t>
@@ -325,7 +308,6 @@
             <w:r>
               <w:rPr>
                 <w:rFonts w:ascii="Times New Roman" w:hAnsi="Times New Roman"/>
-                <w:b w:val="0"/>
                 <w:sz w:val="20"/>
               </w:rPr>
               <w:t>Aeronaves não-tripuladas; Rastreamento; Filtro de Kalman estendido; Redes neurais convolucionais; Visão computacional; Fusão de sensores; Métodos computacionais.</w:t>
@@ -347,7 +329,6 @@
             <w:r>
               <w:rPr>
                 <w:rFonts w:ascii="Times New Roman" w:hAnsi="Times New Roman"/>
-                <w:caps/>
                 <w:sz w:val="15"/>
               </w:rPr>
               <w:t>10. APRESENTAÇÃO:                                                          (X) Nacional     ( ) Internacional</w:t>
@@ -360,7 +341,6 @@
             <w:r>
               <w:rPr>
                 <w:rFonts w:ascii="Times New Roman" w:hAnsi="Times New Roman"/>
-                <w:b w:val="0"/>
                 <w:sz w:val="20"/>
               </w:rPr>
               <w:t>ITA, São José dos Campos. Curso de Mestrado. Programa de Pós-Graduação em Electronic Engineering and Computer Science. Área de Informatics. Orientador: Prof. Dr. Marcos Ricardo Omena de Albuquerque Maximo; Coorientador: Dr. Stiven Schwanz Dias. Defesa em 28/07/2026.</w:t>
@@ -382,7 +362,6 @@
             <w:r>
               <w:rPr>
                 <w:rFonts w:ascii="Times New Roman" w:hAnsi="Times New Roman"/>
-                <w:caps/>
                 <w:sz w:val="15"/>
               </w:rPr>
               <w:t>11. RESUMO:</w:t>
@@ -395,7 +374,6 @@
             <w:r>
               <w:rPr>
                 <w:rFonts w:ascii="Times New Roman" w:hAnsi="Times New Roman"/>
-                <w:b w:val="0"/>
                 <w:sz w:val="20"/>
               </w:rPr>
               <w:t>This dissertation develops the perception (sense) layer of detect-and-avoid for urban unmanned aerial vehicles, structured as a modular camera–point-cloud pipeline: a convolutional neural network locates the obstacle in the image, the detected region is extended into space as a viewing frustum that crops the point cloud, a second network fits a metric three-dimensional box, and an Extended Kalman Filter turns the detections into trajectories with calibrated uncertainty. Three self-contained studies validate the pipeline. The first formulates tracking from a moving platform in the global and local reference frames, proves that the two formulations are mathematically equivalent under a known pose and isotropic process noise, characterizes the regimes in which that equivalence fails, and shows the filter to be near-optimal against the posterior Cramér–Rao bound. The second takes the same estimator onto real quadrotor flights, tracking a person with a single camera and an onboard pose estimate, and demonstrates that propagating the pose uncertainty into the innovation is necessary for statistical consistency. The third builds a synthetic dataset in the AirSim simulator, trains the detection stages, and identifies foreground extraction, rather than the box regressor, as the dominant factor in 3D localization accuracy.</w:t>
@@ -417,7 +395,6 @@
             <w:r>
               <w:rPr>
                 <w:rFonts w:ascii="Times New Roman" w:hAnsi="Times New Roman"/>
-                <w:caps/>
                 <w:sz w:val="15"/>
               </w:rPr>
               <w:t>12. GRAU DE SIGILO:</w:t>
@@ -430,7 +407,6 @@
             <w:r>
               <w:rPr>
                 <w:rFonts w:ascii="Times New Roman" w:hAnsi="Times New Roman"/>
-                <w:b w:val="0"/>
                 <w:sz w:val="20"/>
               </w:rPr>
               <w:t>(X) OSTENSIVO                    ( ) RESERVADO                    ( ) SECRETO</w:t>

</xml_diff>